<commit_message>
Sprint 00-12: Complete CRUD mutation engine
</commit_message>
<xml_diff>
--- a/docs/Developer Notes/YEKDB_Developer_Notes_00-11.docx
+++ b/docs/Developer Notes/YEKDB_Developer_Notes_00-11.docx
@@ -3095,7 +3095,7 @@
           <w:lang w:val="tr-TR"/>
         </w:rPr>
         <w:pict w14:anchorId="300F150B">
-          <v:rect id="_x0000_i1111" style="width:0;height:1.5pt" o:hralign="center" o:hrstd="t" o:hr="t" fillcolor="#a0a0a0" stroked="f"/>
+          <v:rect id="_x0000_i1025" style="width:0;height:1.5pt" o:hralign="center" o:hrstd="t" o:hr="t" fillcolor="#a0a0a0" stroked="f"/>
         </w:pict>
       </w:r>
     </w:p>
@@ -4664,7 +4664,10 @@
       <w:t xml:space="preserve"> </w:t>
     </w:r>
     <w:r>
-      <w:t>10</w:t>
+      <w:t>1</w:t>
+    </w:r>
+    <w:r>
+      <w:t>1</w:t>
     </w:r>
     <w:r>
       <w:t xml:space="preserve">. </w:t>
@@ -7238,6 +7241,7 @@
   <w:style w:type="character" w:default="1" w:styleId="VarsaylanParagrafYazTipi">
     <w:name w:val="Default Paragraph Font"/>
     <w:uiPriority w:val="1"/>
+    <w:semiHidden/>
     <w:unhideWhenUsed/>
   </w:style>
   <w:style w:type="table" w:default="1" w:styleId="NormalTablo">

</xml_diff>